<commit_message>
docs: drop tables that repeat a figure or another table
- RAM, TIMER, PWM: remove the sub-module tables; the block figures
  already show those modules.
- RAM: the instance table keeps port, depth and address slice; base and
  size are in the generated memory map.
- SYSDBG: the clock/reset domain table becomes one sentence (the figure
  labels each domain), and the two CDC tables merge into one.
</commit_message>
<xml_diff>
--- a/doc/QNSC_PWM_MAS.docx
+++ b/doc/QNSC_PWM_MAS.docx
@@ -64,16 +64,6 @@
           </w:pPr>
           <w:r>
             <w:t xml:space="preserve">Table of Tables</w:t>
-          </w:r>
-        </w:p>
-        <w:p>
-          <w:pPr>
-            <w:pStyle w:val="TOC1"/>
-            <w:ind w:left="180"/>
-            <w:jc w:val="left"/>
-          </w:pPr>
-          <w:r>
-            <w:t xml:space="preserve">Table 3-1. PWM sub-modules</w:t>
           </w:r>
         </w:p>
         <w:p>
@@ -962,323 +952,6 @@
         <w:t xml:space="preserve">.</w:t>
       </w:r>
     </w:p>
-    <w:p>
-      <w:pPr>
-        <w:pStyle w:val="Tablecaption0"/>
-      </w:pPr>
-      <w:r>
-        <w:t xml:space="preserve">Table 3-1. PWM sub-modules</w:t>
-      </w:r>
-    </w:p>
-    <w:tbl>
-      <w:tblPr>
-        <w:tblStyle w:val="TableGrid"/>
-        <w:tblW w:type="pct" w:w="5000"/>
-        <w:tblLayout w:type="fixed"/>
-        <w:tblLook w:firstRow="1" w:lastRow="0" w:firstColumn="0" w:lastColumn="0" w:noHBand="0" w:noVBand="0" w:val="0020"/>
-        <w:tblCaption w:val="PWM sub-modules"/>
-      </w:tblPr>
-      <w:tblGrid>
-        <w:gridCol w:w="2376"/>
-        <w:gridCol w:w="3168"/>
-        <w:gridCol w:w="2376"/>
-      </w:tblGrid>
-      <w:tr>
-        <w:trPr>
-          <w:tblHeader w:val="on"/>
-        </w:trPr>
-        <w:tc>
-          <w:tcPr/>
-          <w:p>
-            <w:pPr>
-              <w:pStyle w:val="Compact"/>
-              <w:jc w:val="left"/>
-            </w:pPr>
-            <w:r>
-              <w:t xml:space="preserve">Sub-module</w:t>
-            </w:r>
-          </w:p>
-        </w:tc>
-        <w:tc>
-          <w:tcPr/>
-          <w:p>
-            <w:pPr>
-              <w:pStyle w:val="Compact"/>
-              <w:jc w:val="right"/>
-            </w:pPr>
-            <w:r>
-              <w:t xml:space="preserve">Count</w:t>
-            </w:r>
-          </w:p>
-        </w:tc>
-        <w:tc>
-          <w:tcPr/>
-          <w:p>
-            <w:pPr>
-              <w:pStyle w:val="Compact"/>
-              <w:jc w:val="left"/>
-            </w:pPr>
-            <w:r>
-              <w:t xml:space="preserve">Function</w:t>
-            </w:r>
-          </w:p>
-        </w:tc>
-      </w:tr>
-      <w:tr>
-        <w:tc>
-          <w:tcPr/>
-          <w:p>
-            <w:pPr>
-              <w:pStyle w:val="Compact"/>
-              <w:jc w:val="left"/>
-            </w:pPr>
-            <w:r>
-              <w:rPr>
-                <w:rStyle w:val="VerbatimChar"/>
-              </w:rPr>
-              <w:t xml:space="preserve">adv_timer_apb_if</w:t>
-            </w:r>
-          </w:p>
-        </w:tc>
-        <w:tc>
-          <w:tcPr/>
-          <w:p>
-            <w:pPr>
-              <w:pStyle w:val="Compact"/>
-              <w:jc w:val="right"/>
-            </w:pPr>
-            <w:r>
-              <w:t xml:space="preserve">1</w:t>
-            </w:r>
-          </w:p>
-        </w:tc>
-        <w:tc>
-          <w:tcPr/>
-          <w:p>
-            <w:pPr>
-              <w:pStyle w:val="Compact"/>
-              <w:jc w:val="left"/>
-            </w:pPr>
-            <w:r>
-              <w:t xml:space="preserve">register file, APB decode</w:t>
-            </w:r>
-          </w:p>
-        </w:tc>
-      </w:tr>
-      <w:tr>
-        <w:tc>
-          <w:tcPr/>
-          <w:p>
-            <w:pPr>
-              <w:pStyle w:val="Compact"/>
-              <w:jc w:val="left"/>
-            </w:pPr>
-            <w:r>
-              <w:rPr>
-                <w:rStyle w:val="VerbatimChar"/>
-              </w:rPr>
-              <w:t xml:space="preserve">pulp_clock_gating</w:t>
-            </w:r>
-          </w:p>
-        </w:tc>
-        <w:tc>
-          <w:tcPr/>
-          <w:p>
-            <w:pPr>
-              <w:pStyle w:val="Compact"/>
-              <w:jc w:val="right"/>
-            </w:pPr>
-            <w:r>
-              <w:t xml:space="preserve">4</w:t>
-            </w:r>
-          </w:p>
-        </w:tc>
-        <w:tc>
-          <w:tcPr/>
-          <w:p>
-            <w:pPr>
-              <w:pStyle w:val="Compact"/>
-              <w:jc w:val="left"/>
-            </w:pPr>
-            <w:r>
-              <w:t xml:space="preserve">one clock gate per module, enable</w:t>
-            </w:r>
-            <w:r>
-              <w:t xml:space="preserve"> </w:t>
-            </w:r>
-            <w:r>
-              <w:rPr>
-                <w:rStyle w:val="VerbatimChar"/>
-              </w:rPr>
-              <w:t xml:space="preserve">CH_EN[i]</w:t>
-            </w:r>
-          </w:p>
-        </w:tc>
-      </w:tr>
-      <w:tr>
-        <w:tc>
-          <w:tcPr/>
-          <w:p>
-            <w:pPr>
-              <w:pStyle w:val="Compact"/>
-              <w:jc w:val="left"/>
-            </w:pPr>
-            <w:r>
-              <w:rPr>
-                <w:rStyle w:val="VerbatimChar"/>
-              </w:rPr>
-              <w:t xml:space="preserve">timer_module</w:t>
-            </w:r>
-          </w:p>
-        </w:tc>
-        <w:tc>
-          <w:tcPr/>
-          <w:p>
-            <w:pPr>
-              <w:pStyle w:val="Compact"/>
-              <w:jc w:val="right"/>
-            </w:pPr>
-            <w:r>
-              <w:t xml:space="preserve">4</w:t>
-            </w:r>
-          </w:p>
-        </w:tc>
-        <w:tc>
-          <w:tcPr/>
-          <w:p>
-            <w:pPr>
-              <w:pStyle w:val="Compact"/>
-              <w:jc w:val="left"/>
-            </w:pPr>
-            <w:r>
-              <w:rPr>
-                <w:rStyle w:val="VerbatimChar"/>
-              </w:rPr>
-              <w:t xml:space="preserve">timer_cntrl</w:t>
-            </w:r>
-            <w:r>
-              <w:t xml:space="preserve"> </w:t>
-            </w:r>
-            <w:r>
-              <w:t xml:space="preserve">(</w:t>
-            </w:r>
-            <w:r>
-              <w:rPr>
-                <w:rStyle w:val="VerbatimChar"/>
-              </w:rPr>
-              <w:t xml:space="preserve">CMD</w:t>
-            </w:r>
-            <w:r>
-              <w:t xml:space="preserve">),</w:t>
-            </w:r>
-            <w:r>
-              <w:t xml:space="preserve"> </w:t>
-            </w:r>
-            <w:r>
-              <w:rPr>
-                <w:rStyle w:val="VerbatimChar"/>
-              </w:rPr>
-              <w:t xml:space="preserve">input_stage</w:t>
-            </w:r>
-            <w:r>
-              <w:t xml:space="preserve"> </w:t>
-            </w:r>
-            <w:r>
-              <w:t xml:space="preserve">(7.4),</w:t>
-            </w:r>
-            <w:r>
-              <w:t xml:space="preserve"> </w:t>
-            </w:r>
-            <w:r>
-              <w:rPr>
-                <w:rStyle w:val="VerbatimChar"/>
-              </w:rPr>
-              <w:t xml:space="preserve">prescaler</w:t>
-            </w:r>
-            <w:r>
-              <w:t xml:space="preserve">,</w:t>
-            </w:r>
-            <w:r>
-              <w:t xml:space="preserve"> </w:t>
-            </w:r>
-            <w:r>
-              <w:rPr>
-                <w:rStyle w:val="VerbatimChar"/>
-              </w:rPr>
-              <w:t xml:space="preserve">up_down_counter</w:t>
-            </w:r>
-            <w:r>
-              <w:t xml:space="preserve"> </w:t>
-            </w:r>
-            <w:r>
-              <w:t xml:space="preserve">(7.1), 4 x</w:t>
-            </w:r>
-            <w:r>
-              <w:t xml:space="preserve"> </w:t>
-            </w:r>
-            <w:r>
-              <w:rPr>
-                <w:rStyle w:val="VerbatimChar"/>
-              </w:rPr>
-              <w:t xml:space="preserve">comparator</w:t>
-            </w:r>
-            <w:r>
-              <w:t xml:space="preserve"> </w:t>
-            </w:r>
-            <w:r>
-              <w:t xml:space="preserve">(7.2)</w:t>
-            </w:r>
-          </w:p>
-        </w:tc>
-      </w:tr>
-      <w:tr>
-        <w:tc>
-          <w:tcPr/>
-          <w:p>
-            <w:pPr>
-              <w:pStyle w:val="Compact"/>
-              <w:jc w:val="left"/>
-            </w:pPr>
-            <w:r>
-              <w:t xml:space="preserve">event logic in</w:t>
-            </w:r>
-            <w:r>
-              <w:t xml:space="preserve"> </w:t>
-            </w:r>
-            <w:r>
-              <w:rPr>
-                <w:rStyle w:val="VerbatimChar"/>
-              </w:rPr>
-              <w:t xml:space="preserve">apb_adv_timer</w:t>
-            </w:r>
-          </w:p>
-        </w:tc>
-        <w:tc>
-          <w:tcPr/>
-          <w:p>
-            <w:pPr>
-              <w:pStyle w:val="Compact"/>
-              <w:jc w:val="right"/>
-            </w:pPr>
-            <w:r>
-              <w:t xml:space="preserve">1</w:t>
-            </w:r>
-          </w:p>
-        </w:tc>
-        <w:tc>
-          <w:tcPr/>
-          <w:p>
-            <w:pPr>
-              <w:pStyle w:val="Compact"/>
-              <w:jc w:val="left"/>
-            </w:pPr>
-            <w:r>
-              <w:t xml:space="preserve">four 16:1 multiplexers and edge detectors – 7.5</w:t>
-            </w:r>
-          </w:p>
-        </w:tc>
-      </w:tr>
-    </w:tbl>
     <w:bookmarkEnd w:id="32"/>
     <w:bookmarkStart w:id="33" w:name="ip-used"/>
     <w:p>

</xml_diff>

<commit_message>
docs: rename ports in the owned MAS to Naming Rule V1.0
- SYSDBG V3.1: o_dbg_req (was o_cpu_debug_req), o_dbg_cpu_hold (was
  o_cpu_hold), AXI ports per channel (o_bus_axi_ar_valid, ...). No change
  in behaviour. D21 records that axi_from_mem, which the IP list allows, is
  not instantiated: the teacher's reference design has its own AXI manager.
- RAM V2.3: AXI per channel; macro port o_mem_addr, o_mem_wdata, o_mem_we,
  o_mem_be, o_mem_oe, i_mem_rdata (was o_sram_*).
- TIMER V2.2: SCRC outputs o_rst_n_timer_0/1 (was o_rst_timer0_n).
- PWM V2.2: pad ports o_pad_pwm, i_pad_tim_ext (was o_pwm, i_tim_ext).
- INTMAP already conforms.
- vendor/manifest.yml: pulp-platform/axi is used by the bus only; its note
  no longer says SYSDBG uses axi_from_mem.
</commit_message>
<xml_diff>
--- a/doc/QNSC_PWM_MAS.docx
+++ b/doc/QNSC_PWM_MAS.docx
@@ -15,7 +15,7 @@
         <w:pStyle w:val="Subtitle"/>
       </w:pPr>
       <w:r>
-        <w:t xml:space="preserve">MICRO-ARCHITECTURE SPECIFICATION – V2.1</w:t>
+        <w:t xml:space="preserve">MICRO-ARCHITECTURE SPECIFICATION – V2.2</w:t>
       </w:r>
     </w:p>
     <w:p>
@@ -451,6 +451,134 @@
           </w:p>
         </w:tc>
       </w:tr>
+      <w:tr>
+        <w:tc>
+          <w:tcPr/>
+          <w:p>
+            <w:pPr>
+              <w:pStyle w:val="Compact"/>
+              <w:jc w:val="left"/>
+            </w:pPr>
+            <w:r>
+              <w:t xml:space="preserve">V2.2</w:t>
+            </w:r>
+          </w:p>
+        </w:tc>
+        <w:tc>
+          <w:tcPr/>
+          <w:p>
+            <w:pPr>
+              <w:pStyle w:val="Compact"/>
+              <w:jc w:val="left"/>
+            </w:pPr>
+            <w:r>
+              <w:t xml:space="preserve">2026-09-25</w:t>
+            </w:r>
+          </w:p>
+        </w:tc>
+        <w:tc>
+          <w:tcPr/>
+          <w:p>
+            <w:pPr>
+              <w:pStyle w:val="Compact"/>
+              <w:jc w:val="left"/>
+            </w:pPr>
+            <w:r>
+              <w:t xml:space="preserve">Nghia VT</w:t>
+            </w:r>
+          </w:p>
+        </w:tc>
+        <w:tc>
+          <w:tcPr/>
+          <w:p>
+            <w:pPr>
+              <w:pStyle w:val="Compact"/>
+              <w:jc w:val="left"/>
+            </w:pPr>
+            <w:r>
+              <w:t xml:space="preserve">–</w:t>
+            </w:r>
+          </w:p>
+        </w:tc>
+        <w:tc>
+          <w:tcPr/>
+          <w:p>
+            <w:pPr>
+              <w:pStyle w:val="Compact"/>
+              <w:jc w:val="left"/>
+            </w:pPr>
+            <w:r>
+              <w:t xml:space="preserve">Pad ports named</w:t>
+            </w:r>
+            <w:r>
+              <w:t xml:space="preserve"> </w:t>
+            </w:r>
+            <w:r>
+              <w:rPr>
+                <w:rStyle w:val="VerbatimChar"/>
+              </w:rPr>
+              <w:t xml:space="preserve">o_pad_pwm</w:t>
+            </w:r>
+            <w:r>
+              <w:t xml:space="preserve">,</w:t>
+            </w:r>
+            <w:r>
+              <w:t xml:space="preserve"> </w:t>
+            </w:r>
+            <w:r>
+              <w:rPr>
+                <w:rStyle w:val="VerbatimChar"/>
+              </w:rPr>
+              <w:t xml:space="preserve">i_pad_tim_ext</w:t>
+            </w:r>
+            <w:r>
+              <w:t xml:space="preserve"> </w:t>
+            </w:r>
+            <w:r>
+              <w:t xml:space="preserve">(was</w:t>
+            </w:r>
+            <w:r>
+              <w:t xml:space="preserve"> </w:t>
+            </w:r>
+            <w:r>
+              <w:rPr>
+                <w:rStyle w:val="VerbatimChar"/>
+              </w:rPr>
+              <w:t xml:space="preserve">o_pwm</w:t>
+            </w:r>
+            <w:r>
+              <w:t xml:space="preserve">,</w:t>
+            </w:r>
+            <w:r>
+              <w:t xml:space="preserve"> </w:t>
+            </w:r>
+            <w:r>
+              <w:rPr>
+                <w:rStyle w:val="VerbatimChar"/>
+              </w:rPr>
+              <w:t xml:space="preserve">i_tim_ext</w:t>
+            </w:r>
+            <w:r>
+              <w:t xml:space="preserve">), per</w:t>
+            </w:r>
+            <w:r>
+              <w:t xml:space="preserve"> </w:t>
+            </w:r>
+            <w:r>
+              <w:rPr>
+                <w:rStyle w:val="VerbatimChar"/>
+              </w:rPr>
+              <w:t xml:space="preserve">QNSC_RTL_Design_Naming_Rule</w:t>
+            </w:r>
+            <w:r>
+              <w:t xml:space="preserve"> </w:t>
+            </w:r>
+            <w:r>
+              <w:t xml:space="preserve">3.8</w:t>
+            </w:r>
+          </w:p>
+        </w:tc>
+      </w:tr>
     </w:tbl>
     <w:bookmarkEnd w:id="26"/>
     <w:bookmarkStart w:id="27" w:name="overview"/>
@@ -1294,7 +1422,7 @@
         <w:rPr>
           <w:rStyle w:val="VerbatimChar"/>
         </w:rPr>
-        <w:t xml:space="preserve">o_pwm</w:t>
+        <w:t xml:space="preserve">o_pad_pwm</w:t>
       </w:r>
       <w:r>
         <w:t xml:space="preserve"> </w:t>
@@ -1895,7 +2023,7 @@
               <w:rPr>
                 <w:rStyle w:val="VerbatimChar"/>
               </w:rPr>
-              <w:t xml:space="preserve">i_tim_ext</w:t>
+              <w:t xml:space="preserve">i_pad_tim_ext</w:t>
             </w:r>
           </w:p>
         </w:tc>
@@ -1993,7 +2121,7 @@
               <w:rPr>
                 <w:rStyle w:val="VerbatimChar"/>
               </w:rPr>
-              <w:t xml:space="preserve">o_pwm</w:t>
+              <w:t xml:space="preserve">o_pad_pwm</w:t>
             </w:r>
           </w:p>
         </w:tc>
@@ -5071,7 +5199,7 @@
               <w:rPr>
                 <w:rStyle w:val="VerbatimChar"/>
               </w:rPr>
-              <w:t xml:space="preserve">o_pwm[3:0]</w:t>
+              <w:t xml:space="preserve">o_pad_pwm[3:0]</w:t>
             </w:r>
           </w:p>
         </w:tc>
@@ -5130,7 +5258,7 @@
               <w:rPr>
                 <w:rStyle w:val="VerbatimChar"/>
               </w:rPr>
-              <w:t xml:space="preserve">o_pwm[7:4]</w:t>
+              <w:t xml:space="preserve">o_pad_pwm[7:4]</w:t>
             </w:r>
           </w:p>
         </w:tc>
@@ -5168,7 +5296,7 @@
         <w:rPr>
           <w:rStyle w:val="VerbatimChar"/>
         </w:rPr>
-        <w:t xml:space="preserve">o_pwm[7:0]</w:t>
+        <w:t xml:space="preserve">o_pad_pwm[7:0]</w:t>
       </w:r>
       <w:r>
         <w:t xml:space="preserve">. Which package pin carries each function is the</w:t>
@@ -7563,7 +7691,7 @@
         <w:rPr>
           <w:rStyle w:val="VerbatimChar"/>
         </w:rPr>
-        <w:t xml:space="preserve">o_pwm[3:0]</w:t>
+        <w:t xml:space="preserve">o_pad_pwm[3:0]</w:t>
       </w:r>
       <w:r>
         <w:t xml:space="preserve"> </w:t>
@@ -7590,7 +7718,7 @@
         <w:rPr>
           <w:rStyle w:val="VerbatimChar"/>
         </w:rPr>
-        <w:t xml:space="preserve">o_pwm[7:4]</w:t>
+        <w:t xml:space="preserve">o_pad_pwm[7:4]</w:t>
       </w:r>
       <w:r>
         <w:t xml:space="preserve"> </w:t>
@@ -8875,7 +9003,7 @@
       <w:rPr>
         <w:szCs w:val="26"/>
       </w:rPr>
-      <w:t>V2.1</w:t>
+      <w:t>V2.2</w:t>
     </w:r>
     <w:r>
       <w:rPr>

</xml_diff>

<commit_message>
feat(contract): move the APB peripherals after GPIO3 up one slot
GPIO3 was dropped with the 40-pin package. The P_BUS owner decided to close
the gap instead of leaving APB_M6 empty, so every peripheral after it moves
up one port and one 16 KiB window, keeping APB_Mn at 0x8000_0000 + n x 0x4000:

  timer_0  APB_M7  -> M6   0x8001_C000 -> 0x8001_8000
  timer_1  APB_M8  -> M7   0x8002_0000 -> 0x8001_C000
  uart_0   APB_M9  -> M8   0x8002_4000 -> 0x8002_0000
  uart_1   APB_M10 -> M9   0x8002_8000 -> 0x8002_4000
  spi      APB_M11 -> M10  0x8002_C000 -> 0x8002_8000
  i2c      APB_M12 -> M11  0x8003_0000 -> 0x8002_C000
  pwm      APB_M13 -> M12  0x8003_4000 -> 0x8003_0000
  dma_cfg  APB_M14 -> M13  0x8003_8000 -> 0x8003_4000

qnsc_pkg regenerated. The chip diagram, README (14 APB slaves),
design/README instance table, TIMER MAS V2.3, the PWM MAS text and the
timer and PWM figures follow. Interrupt lines do not change.
</commit_message>
<xml_diff>
--- a/doc/QNSC_PWM_MAS.docx
+++ b/doc/QNSC_PWM_MAS.docx
@@ -628,7 +628,7 @@
         <w:rPr>
           <w:rStyle w:val="VerbatimChar"/>
         </w:rPr>
-        <w:t xml:space="preserve">APB_M13</w:t>
+        <w:t xml:space="preserve">APB_M12</w:t>
       </w:r>
       <w:r>
         <w:t xml:space="preserve">, at</w:t>
@@ -640,7 +640,7 @@
         <w:rPr>
           <w:rStyle w:val="VerbatimChar"/>
         </w:rPr>
-        <w:t xml:space="preserve">0x80034000</w:t>
+        <w:t xml:space="preserve">0x80030000</w:t>
       </w:r>
       <w:r>
         <w:t xml:space="preserve">,</w:t>
@@ -6648,7 +6648,7 @@
         <w:rPr>
           <w:rStyle w:val="VerbatimChar"/>
         </w:rPr>
-        <w:t xml:space="preserve">APB_M13</w:t>
+        <w:t xml:space="preserve">APB_M12</w:t>
       </w:r>
       <w:r>
         <w:t xml:space="preserve">, with</w:t>

</xml_diff>

<commit_message>
feat(contract): move the APB peripherals after GPIO3 up one slot (#27)
GPIO3 was dropped with the 40-pin package. The P_BUS owner decided to close
the gap instead of leaving APB_M6 empty, so every peripheral after it moves
up one port and one 16 KiB window, keeping APB_Mn at 0x8000_0000 + n x 0x4000:

  timer_0  APB_M7  -> M6   0x8001_C000 -> 0x8001_8000
  timer_1  APB_M8  -> M7   0x8002_0000 -> 0x8001_C000
  uart_0   APB_M9  -> M8   0x8002_4000 -> 0x8002_0000
  uart_1   APB_M10 -> M9   0x8002_8000 -> 0x8002_4000
  spi      APB_M11 -> M10  0x8002_C000 -> 0x8002_8000
  i2c      APB_M12 -> M11  0x8003_0000 -> 0x8002_C000
  pwm      APB_M13 -> M12  0x8003_4000 -> 0x8003_0000
  dma_cfg  APB_M14 -> M13  0x8003_8000 -> 0x8003_4000

qnsc_pkg regenerated. The chip diagram, README (14 APB slaves),
design/README instance table, TIMER MAS V2.3, the PWM MAS text and the
timer and PWM figures follow. Interrupt lines do not change.
</commit_message>
<xml_diff>
--- a/doc/QNSC_PWM_MAS.docx
+++ b/doc/QNSC_PWM_MAS.docx
@@ -628,7 +628,7 @@
         <w:rPr>
           <w:rStyle w:val="VerbatimChar"/>
         </w:rPr>
-        <w:t xml:space="preserve">APB_M13</w:t>
+        <w:t xml:space="preserve">APB_M12</w:t>
       </w:r>
       <w:r>
         <w:t xml:space="preserve">, at</w:t>
@@ -640,7 +640,7 @@
         <w:rPr>
           <w:rStyle w:val="VerbatimChar"/>
         </w:rPr>
-        <w:t xml:space="preserve">0x80034000</w:t>
+        <w:t xml:space="preserve">0x80030000</w:t>
       </w:r>
       <w:r>
         <w:t xml:space="preserve">,</w:t>
@@ -6648,7 +6648,7 @@
         <w:rPr>
           <w:rStyle w:val="VerbatimChar"/>
         </w:rPr>
-        <w:t xml:space="preserve">APB_M13</w:t>
+        <w:t xml:space="preserve">APB_M12</w:t>
       </w:r>
       <w:r>
         <w:t xml:space="preserve">, with</w:t>

</xml_diff>